<commit_message>
added comité and  responsible selection of photo in the expostion
</commit_message>
<xml_diff>
--- a/guide_du_site.docx
+++ b/guide_du_site.docx
@@ -2349,7 +2349,7 @@
           <w:color w:val="374151"/>
           <w:sz w:val="24"/>
         </w:rPr>
-        <w:t>Le principe</w:t>
+        <w:t>Les phases principales</w:t>
       </w:r>
     </w:p>
     <w:p>
@@ -2359,7 +2359,7 @@
           <w:rFonts w:ascii="Calibri" w:hAnsi="Calibri"/>
           <w:sz w:val="22"/>
         </w:rPr>
-        <w:t>Une exposition se déroule en plusieurs phases. Les membres participent à la définition du thème, puis soumettent leurs photos.</w:t>
+        <w:t>Une exposition se déroule en plusieurs phases. Les membres participent à la définition du thème, puis soumettent leurs photos pour sélection par un comité.</w:t>
       </w:r>
     </w:p>
     <w:tbl>
@@ -2403,7 +2403,7 @@
                 <w:rFonts w:ascii="Calibri" w:hAnsi="Calibri"/>
                 <w:sz w:val="20"/>
               </w:rPr>
-              <w:t>Proposez des idées de thèmes pour l’exposition.</w:t>
+              <w:t>Proposez des idées de thèmes pour l'exposition.</w:t>
             </w:r>
           </w:p>
         </w:tc>
@@ -2475,7 +2475,204 @@
                 <w:rFonts w:ascii="Calibri" w:hAnsi="Calibri"/>
                 <w:sz w:val="20"/>
               </w:rPr>
-              <w:t>Le thème est choisi. Uploadez vos photos pour l’exposition.</w:t>
+              <w:t>Le thème est choisi. Uploadez vos photos et soumettez-les au comité.</w:t>
+            </w:r>
+          </w:p>
+        </w:tc>
+      </w:tr>
+      <w:tr>
+        <w:tc>
+          <w:tcPr>
+            <w:tcW w:type="dxa" w:w="2551"/>
+            <w:shd w:val="clear" w:color="auto" w:fill="EDE9FE"/>
+          </w:tcPr>
+          <w:p>
+            <w:pPr>
+              <w:jc w:val="center"/>
+            </w:pPr>
+            <w:r>
+              <w:rPr>
+                <w:rFonts w:ascii="Calibri" w:hAnsi="Calibri"/>
+                <w:b/>
+                <w:color w:val="5B21B6"/>
+                <w:sz w:val="18"/>
+              </w:rPr>
+              <w:t>En exposition</w:t>
+            </w:r>
+          </w:p>
+        </w:tc>
+        <w:tc>
+          <w:tcPr>
+            <w:tcW w:type="dxa" w:w="4703"/>
+          </w:tcPr>
+          <w:p>
+            <w:r>
+              <w:rPr>
+                <w:rFonts w:ascii="Calibri" w:hAnsi="Calibri"/>
+                <w:sz w:val="20"/>
+              </w:rPr>
+              <w:t>La galerie des photos retenues est accessible.</w:t>
+            </w:r>
+          </w:p>
+        </w:tc>
+      </w:tr>
+    </w:tbl>
+    <w:p/>
+    <w:p>
+      <w:pPr>
+        <w:pStyle w:val="Heading3"/>
+      </w:pPr>
+      <w:r>
+        <w:rPr>
+          <w:rFonts w:ascii="Calibri" w:hAnsi="Calibri"/>
+          <w:b/>
+          <w:color w:val="374151"/>
+          <w:sz w:val="24"/>
+        </w:rPr>
+        <w:t>Participer</w:t>
+      </w:r>
+    </w:p>
+    <w:p>
+      <w:pPr>
+        <w:pStyle w:val="ListBullet"/>
+        <w:ind w:left="283"/>
+      </w:pPr>
+      <w:r>
+        <w:rPr>
+          <w:rFonts w:ascii="Calibri" w:hAnsi="Calibri"/>
+          <w:sz w:val="22"/>
+        </w:rPr>
+        <w:t>Idéation : proposez un ou plusieurs thèmes dans la zone prévue.</w:t>
+      </w:r>
+    </w:p>
+    <w:p>
+      <w:pPr>
+        <w:pStyle w:val="ListBullet"/>
+        <w:ind w:left="283"/>
+      </w:pPr>
+      <w:r>
+        <w:rPr>
+          <w:rFonts w:ascii="Calibri" w:hAnsi="Calibri"/>
+          <w:sz w:val="22"/>
+        </w:rPr>
+        <w:t>Vote : utilisez vos jetons de vote pour soutenir les thèmes. Vous pouvez répartir vos votes sur plusieurs thèmes.</w:t>
+      </w:r>
+    </w:p>
+    <w:p>
+      <w:pPr>
+        <w:pStyle w:val="ListBullet"/>
+        <w:ind w:left="283"/>
+      </w:pPr>
+      <w:r>
+        <w:rPr>
+          <w:rFonts w:ascii="Calibri" w:hAnsi="Calibri"/>
+          <w:sz w:val="22"/>
+        </w:rPr>
+        <w:t>Soumission : uploadez vos photos, puis cliquez Soumettre au comité quand vous êtes satisfait. Après soumission, vous ne pouvez plus modifier vos photos.</w:t>
+      </w:r>
+    </w:p>
+    <w:p>
+      <w:pPr>
+        <w:pStyle w:val="Heading3"/>
+      </w:pPr>
+      <w:r>
+        <w:rPr>
+          <w:rFonts w:ascii="Calibri" w:hAnsi="Calibri"/>
+          <w:b/>
+          <w:color w:val="374151"/>
+          <w:sz w:val="24"/>
+        </w:rPr>
+        <w:t>Votre dossier — statuts possibles</w:t>
+      </w:r>
+    </w:p>
+    <w:p>
+      <w:pPr/>
+      <w:r>
+        <w:rPr>
+          <w:rFonts w:ascii="Calibri" w:hAnsi="Calibri"/>
+          <w:sz w:val="22"/>
+        </w:rPr>
+        <w:t>Une fois en phase Soumission, votre dossier passe par plusieurs étapes :</w:t>
+      </w:r>
+    </w:p>
+    <w:tbl>
+      <w:tblPr>
+        <w:tblStyle w:val="TableGrid"/>
+        <w:tblW w:type="auto" w:w="0"/>
+        <w:tblLook w:firstColumn="1" w:firstRow="1" w:lastColumn="0" w:lastRow="0" w:noHBand="0" w:noVBand="1" w:val="04A0"/>
+      </w:tblPr>
+      <w:tblGrid>
+        <w:gridCol w:w="4703"/>
+        <w:gridCol w:w="4703"/>
+      </w:tblGrid>
+      <w:tr>
+        <w:tc>
+          <w:tcPr>
+            <w:tcW w:type="dxa" w:w="2551"/>
+            <w:shd w:val="clear" w:color="auto" w:fill="DCFCE7"/>
+          </w:tcPr>
+          <w:p>
+            <w:pPr>
+              <w:jc w:val="center"/>
+            </w:pPr>
+            <w:r>
+              <w:rPr>
+                <w:rFonts w:ascii="Calibri" w:hAnsi="Calibri"/>
+                <w:b/>
+                <w:color w:val="166534"/>
+                <w:sz w:val="18"/>
+              </w:rPr>
+              <w:t>Soumission</w:t>
+            </w:r>
+          </w:p>
+        </w:tc>
+        <w:tc>
+          <w:tcPr>
+            <w:tcW w:type="dxa" w:w="4703"/>
+          </w:tcPr>
+          <w:p>
+            <w:r>
+              <w:rPr>
+                <w:rFonts w:ascii="Calibri" w:hAnsi="Calibri"/>
+                <w:sz w:val="20"/>
+              </w:rPr>
+              <w:t>Vous pouvez uploader et supprimer vos photos librement.</w:t>
+            </w:r>
+          </w:p>
+        </w:tc>
+      </w:tr>
+      <w:tr>
+        <w:tc>
+          <w:tcPr>
+            <w:tcW w:type="dxa" w:w="2551"/>
+            <w:shd w:val="clear" w:color="auto" w:fill="DBEAFE"/>
+          </w:tcPr>
+          <w:p>
+            <w:pPr>
+              <w:jc w:val="center"/>
+            </w:pPr>
+            <w:r>
+              <w:rPr>
+                <w:rFonts w:ascii="Calibri" w:hAnsi="Calibri"/>
+                <w:b/>
+                <w:color w:val="1D4ED8"/>
+                <w:sz w:val="18"/>
+              </w:rPr>
+              <w:t>En évaluation</w:t>
+            </w:r>
+          </w:p>
+        </w:tc>
+        <w:tc>
+          <w:tcPr>
+            <w:tcW w:type="dxa" w:w="4703"/>
+          </w:tcPr>
+          <w:p>
+            <w:r>
+              <w:rPr>
+                <w:rFonts w:ascii="Calibri" w:hAnsi="Calibri"/>
+                <w:sz w:val="20"/>
+              </w:rPr>
+              <w:t>Vous avez soumis. Vos photos ne sont plus modifiables. Si le comité a évalué, des scores apparaissent sur vos photos.</w:t>
             </w:r>
           </w:p>
         </w:tc>
@@ -2511,66 +2708,42 @@
                 <w:rFonts w:ascii="Calibri" w:hAnsi="Calibri"/>
                 <w:sz w:val="20"/>
               </w:rPr>
-              <w:t>La galerie des photos de l’exposition est accessible.</w:t>
+              <w:t>Le responsable a fait la sélection finale. Les photos retenues sont marquées d'une étoile ★.</w:t>
             </w:r>
           </w:p>
         </w:tc>
       </w:tr>
     </w:tbl>
     <w:p/>
-    <w:p>
-      <w:pPr>
-        <w:pStyle w:val="Heading3"/>
-      </w:pPr>
-      <w:r>
-        <w:rPr>
-          <w:rFonts w:ascii="Calibri" w:hAnsi="Calibri"/>
-          <w:b/>
-          <w:color w:val="374151"/>
-          <w:sz w:val="24"/>
-        </w:rPr>
-        <w:t>Participer</w:t>
-      </w:r>
-    </w:p>
-    <w:p>
-      <w:pPr>
-        <w:pStyle w:val="ListBullet"/>
-        <w:ind w:left="283"/>
-      </w:pPr>
-      <w:r>
-        <w:rPr>
-          <w:rFonts w:ascii="Calibri" w:hAnsi="Calibri"/>
-          <w:sz w:val="22"/>
-        </w:rPr>
-        <w:t>Idéation : proposez un ou plusieurs thèmes dans la zone prévue.</w:t>
-      </w:r>
-    </w:p>
-    <w:p>
-      <w:pPr>
-        <w:pStyle w:val="ListBullet"/>
-        <w:ind w:left="283"/>
-      </w:pPr>
-      <w:r>
-        <w:rPr>
-          <w:rFonts w:ascii="Calibri" w:hAnsi="Calibri"/>
-          <w:sz w:val="22"/>
-        </w:rPr>
-        <w:t>Vote : utilisez vos jetons de vote pour soutenir les thèmes. Vous pouvez répartir vos votes sur plusieurs thèmes.</w:t>
-      </w:r>
-    </w:p>
-    <w:p>
-      <w:pPr>
-        <w:pStyle w:val="ListBullet"/>
-        <w:ind w:left="283"/>
-      </w:pPr>
-      <w:r>
-        <w:rPr>
-          <w:rFonts w:ascii="Calibri" w:hAnsi="Calibri"/>
-          <w:sz w:val="22"/>
-        </w:rPr>
-        <w:t>Soumission : uploadez vos photos dans la zone dédiée, dans la limite fixée par l’organisateur.</w:t>
-      </w:r>
-    </w:p>
+    <w:tbl>
+      <w:tblPr>
+        <w:tblStyle w:val="TableGrid"/>
+        <w:tblW w:type="auto" w:w="0"/>
+        <w:tblLook w:firstColumn="1" w:firstRow="1" w:lastColumn="0" w:lastRow="0" w:noHBand="0" w:noVBand="1" w:val="04A0"/>
+      </w:tblPr>
+      <w:tblGrid>
+        <w:gridCol w:w="9406"/>
+      </w:tblGrid>
+      <w:tr>
+        <w:tc>
+          <w:tcPr>
+            <w:tcW w:type="dxa" w:w="9406"/>
+            <w:shd w:val="clear" w:color="auto" w:fill="FFFBEB"/>
+          </w:tcPr>
+          <w:p>
+            <w:r>
+              <w:rPr>
+                <w:rFonts w:ascii="Calibri" w:hAnsi="Calibri"/>
+                <w:color w:val="78350F"/>
+                <w:sz w:val="20"/>
+              </w:rPr>
+              <w:t>ℹ  Si le responsable vous renvoie en soumission (pour ajouter une photo par exemple), vous retrouvez accès à votre dossier et pouvez à nouveau modifier et re-soumettre.</w:t>
+            </w:r>
+          </w:p>
+        </w:tc>
+      </w:tr>
+    </w:tbl>
+    <w:p/>
     <w:p>
       <w:r>
         <w:br w:type="page"/>
@@ -3825,7 +3998,7 @@
           <w:rFonts w:ascii="Calibri" w:hAnsi="Calibri"/>
           <w:sz w:val="22"/>
         </w:rPr>
-        <w:t>Définissez les dates d’idéation (début et fin, obligatoires).</w:t>
+        <w:t>Définissez les dates d'idéation (début et fin, obligatoires).</w:t>
       </w:r>
     </w:p>
     <w:p>
@@ -3838,7 +4011,7 @@
           <w:rFonts w:ascii="Calibri" w:hAnsi="Calibri"/>
           <w:sz w:val="22"/>
         </w:rPr>
-        <w:t>Optionnel : date physique de l’exposition et date d’ouverture au public.</w:t>
+        <w:t>Optionnel : date physique de l'exposition et date d'ouverture au public.</w:t>
       </w:r>
     </w:p>
     <w:p>
@@ -3864,7 +4037,7 @@
           <w:rFonts w:ascii="Calibri" w:hAnsi="Calibri"/>
           <w:sz w:val="22"/>
         </w:rPr>
-        <w:t>Cliquez Créer — l’exposition démarre en phase Idéation.</w:t>
+        <w:t>Cliquez Créer — l'exposition démarre en phase Idéation.</w:t>
       </w:r>
     </w:p>
     <w:p>
@@ -3878,7 +4051,7 @@
           <w:color w:val="374151"/>
           <w:sz w:val="24"/>
         </w:rPr>
-        <w:t>Cycle de vie</w:t>
+        <w:t>Cycle de vie global</w:t>
       </w:r>
     </w:p>
     <w:tbl>
@@ -3922,7 +4095,7 @@
                 <w:rFonts w:ascii="Calibri" w:hAnsi="Calibri"/>
                 <w:sz w:val="20"/>
               </w:rPr>
-              <w:t>Les membres proposent des thèmes. Bouton Terminer l’idéation pour passer à la suite.</w:t>
+              <w:t>Les membres proposent des thèmes. Bouton Terminer l'idéation pour passer à la suite.</w:t>
             </w:r>
           </w:p>
         </w:tc>
@@ -4030,7 +4203,259 @@
                 <w:rFonts w:ascii="Calibri" w:hAnsi="Calibri"/>
                 <w:sz w:val="20"/>
               </w:rPr>
-              <w:t>Choisissez le thème définitif, les membres uploadent leurs photos. Bouton Clôturer.</w:t>
+              <w:t>Thème définitif choisi. Les membres uploadent et soumettent leurs photos au comité.</w:t>
+            </w:r>
+          </w:p>
+        </w:tc>
+      </w:tr>
+      <w:tr>
+        <w:tc>
+          <w:tcPr>
+            <w:tcW w:type="dxa" w:w="2551"/>
+            <w:shd w:val="clear" w:color="auto" w:fill="EDE9FE"/>
+          </w:tcPr>
+          <w:p>
+            <w:pPr>
+              <w:jc w:val="center"/>
+            </w:pPr>
+            <w:r>
+              <w:rPr>
+                <w:rFonts w:ascii="Calibri" w:hAnsi="Calibri"/>
+                <w:b/>
+                <w:color w:val="5B21B6"/>
+                <w:sz w:val="18"/>
+              </w:rPr>
+              <w:t>En exposition</w:t>
+            </w:r>
+          </w:p>
+        </w:tc>
+        <w:tc>
+          <w:tcPr>
+            <w:tcW w:type="dxa" w:w="4703"/>
+          </w:tcPr>
+          <w:p>
+            <w:r>
+              <w:rPr>
+                <w:rFonts w:ascii="Calibri" w:hAnsi="Calibri"/>
+                <w:sz w:val="20"/>
+              </w:rPr>
+              <w:t>Sélection figée. Galerie des photos retenues visible.</w:t>
+            </w:r>
+          </w:p>
+        </w:tc>
+      </w:tr>
+    </w:tbl>
+    <w:p/>
+    <w:tbl>
+      <w:tblPr>
+        <w:tblStyle w:val="TableGrid"/>
+        <w:tblW w:type="auto" w:w="0"/>
+        <w:tblLook w:firstColumn="1" w:firstRow="1" w:lastColumn="0" w:lastRow="0" w:noHBand="0" w:noVBand="1" w:val="04A0"/>
+      </w:tblPr>
+      <w:tblGrid>
+        <w:gridCol w:w="9406"/>
+      </w:tblGrid>
+      <w:tr>
+        <w:tc>
+          <w:tcPr>
+            <w:tcW w:type="dxa" w:w="9406"/>
+            <w:shd w:val="clear" w:color="auto" w:fill="FFFBEB"/>
+          </w:tcPr>
+          <w:p>
+            <w:r>
+              <w:rPr>
+                <w:rFonts w:ascii="Calibri" w:hAnsi="Calibri"/>
+                <w:color w:val="78350F"/>
+                <w:sz w:val="20"/>
+              </w:rPr>
+              <w:t>ℹ  Le titre, la description et les dates sont modifiables à tout moment via ✏ Modifier.</w:t>
+            </w:r>
+          </w:p>
+        </w:tc>
+      </w:tr>
+    </w:tbl>
+    <w:p/>
+    <w:p>
+      <w:pPr>
+        <w:pStyle w:val="Heading3"/>
+      </w:pPr>
+      <w:r>
+        <w:rPr>
+          <w:rFonts w:ascii="Calibri" w:hAnsi="Calibri"/>
+          <w:b/>
+          <w:color w:val="374151"/>
+          <w:sz w:val="24"/>
+        </w:rPr>
+        <w:t>Configurer le comité</w:t>
+      </w:r>
+    </w:p>
+    <w:p>
+      <w:pPr/>
+      <w:r>
+        <w:rPr>
+          <w:rFonts w:ascii="Calibri" w:hAnsi="Calibri"/>
+          <w:sz w:val="22"/>
+        </w:rPr>
+        <w:t>Pendant la phase Soumission, désignez un responsable du comité et les membres évaluateurs via le bouton Comité.</w:t>
+      </w:r>
+    </w:p>
+    <w:p>
+      <w:pPr>
+        <w:pStyle w:val="ListBullet"/>
+        <w:ind w:left="283"/>
+      </w:pPr>
+      <w:r>
+        <w:rPr>
+          <w:rFonts w:ascii="Calibri" w:hAnsi="Calibri"/>
+          <w:sz w:val="22"/>
+        </w:rPr>
+        <w:t>Responsable du comité : celui qui fait la sélection finale et clôture les dossiers.</w:t>
+      </w:r>
+    </w:p>
+    <w:p>
+      <w:pPr>
+        <w:pStyle w:val="ListBullet"/>
+        <w:ind w:left="283"/>
+      </w:pPr>
+      <w:r>
+        <w:rPr>
+          <w:rFonts w:ascii="Calibri" w:hAnsi="Calibri"/>
+          <w:sz w:val="22"/>
+        </w:rPr>
+        <w:t>Membres du comité : ceux qui classent les photos de chaque dossier.</w:t>
+      </w:r>
+    </w:p>
+    <w:tbl>
+      <w:tblPr>
+        <w:tblStyle w:val="TableGrid"/>
+        <w:tblW w:type="auto" w:w="0"/>
+        <w:tblLook w:firstColumn="1" w:firstRow="1" w:lastColumn="0" w:lastRow="0" w:noHBand="0" w:noVBand="1" w:val="04A0"/>
+      </w:tblPr>
+      <w:tblGrid>
+        <w:gridCol w:w="9406"/>
+      </w:tblGrid>
+      <w:tr>
+        <w:tc>
+          <w:tcPr>
+            <w:tcW w:type="dxa" w:w="9406"/>
+            <w:shd w:val="clear" w:color="auto" w:fill="FFFBEB"/>
+          </w:tcPr>
+          <w:p>
+            <w:r>
+              <w:rPr>
+                <w:rFonts w:ascii="Calibri" w:hAnsi="Calibri"/>
+                <w:color w:val="78350F"/>
+                <w:sz w:val="20"/>
+              </w:rPr>
+              <w:t>ℹ  Un membre retiré du comité voit ses évaluations automatiquement supprimées.</w:t>
+            </w:r>
+          </w:p>
+        </w:tc>
+      </w:tr>
+    </w:tbl>
+    <w:p/>
+    <w:p>
+      <w:pPr>
+        <w:pStyle w:val="Heading3"/>
+      </w:pPr>
+      <w:r>
+        <w:rPr>
+          <w:rFonts w:ascii="Calibri" w:hAnsi="Calibri"/>
+          <w:b/>
+          <w:color w:val="374151"/>
+          <w:sz w:val="24"/>
+        </w:rPr>
+        <w:t>Phase Soumission — tableau de bord</w:t>
+      </w:r>
+    </w:p>
+    <w:p>
+      <w:pPr/>
+      <w:r>
+        <w:rPr>
+          <w:rFonts w:ascii="Calibri" w:hAnsi="Calibri"/>
+          <w:sz w:val="22"/>
+        </w:rPr>
+        <w:t>Le tableau de bord liste tous les participants avec leur statut de dossier et le nombre de photos. Cliquez sur une ligne pour ouvrir le dossier du participant.</w:t>
+      </w:r>
+    </w:p>
+    <w:tbl>
+      <w:tblPr>
+        <w:tblStyle w:val="TableGrid"/>
+        <w:tblW w:type="auto" w:w="0"/>
+        <w:tblLook w:firstColumn="1" w:firstRow="1" w:lastColumn="0" w:lastRow="0" w:noHBand="0" w:noVBand="1" w:val="04A0"/>
+      </w:tblPr>
+      <w:tblGrid>
+        <w:gridCol w:w="4703"/>
+        <w:gridCol w:w="4703"/>
+      </w:tblGrid>
+      <w:tr>
+        <w:tc>
+          <w:tcPr>
+            <w:tcW w:type="dxa" w:w="2551"/>
+            <w:shd w:val="clear" w:color="auto" w:fill="DCFCE7"/>
+          </w:tcPr>
+          <w:p>
+            <w:pPr>
+              <w:jc w:val="center"/>
+            </w:pPr>
+            <w:r>
+              <w:rPr>
+                <w:rFonts w:ascii="Calibri" w:hAnsi="Calibri"/>
+                <w:b/>
+                <w:color w:val="166534"/>
+                <w:sz w:val="18"/>
+              </w:rPr>
+              <w:t>Soumission</w:t>
+            </w:r>
+          </w:p>
+        </w:tc>
+        <w:tc>
+          <w:tcPr>
+            <w:tcW w:type="dxa" w:w="4703"/>
+          </w:tcPr>
+          <w:p>
+            <w:r>
+              <w:rPr>
+                <w:rFonts w:ascii="Calibri" w:hAnsi="Calibri"/>
+                <w:sz w:val="20"/>
+              </w:rPr>
+              <w:t>Le membre peut encore modifier ses photos.</w:t>
+            </w:r>
+          </w:p>
+        </w:tc>
+      </w:tr>
+      <w:tr>
+        <w:tc>
+          <w:tcPr>
+            <w:tcW w:type="dxa" w:w="2551"/>
+            <w:shd w:val="clear" w:color="auto" w:fill="DBEAFE"/>
+          </w:tcPr>
+          <w:p>
+            <w:pPr>
+              <w:jc w:val="center"/>
+            </w:pPr>
+            <w:r>
+              <w:rPr>
+                <w:rFonts w:ascii="Calibri" w:hAnsi="Calibri"/>
+                <w:b/>
+                <w:color w:val="1D4ED8"/>
+                <w:sz w:val="18"/>
+              </w:rPr>
+              <w:t>En évaluation</w:t>
+            </w:r>
+          </w:p>
+        </w:tc>
+        <w:tc>
+          <w:tcPr>
+            <w:tcW w:type="dxa" w:w="4703"/>
+          </w:tcPr>
+          <w:p>
+            <w:r>
+              <w:rPr>
+                <w:rFonts w:ascii="Calibri" w:hAnsi="Calibri"/>
+                <w:sz w:val="20"/>
+              </w:rPr>
+              <w:t>Le membre a soumis. Le comité peut évaluer.</w:t>
             </w:r>
           </w:p>
         </w:tc>
@@ -4066,42 +4491,176 @@
                 <w:rFonts w:ascii="Calibri" w:hAnsi="Calibri"/>
                 <w:sz w:val="20"/>
               </w:rPr>
-              <w:t>Galerie des photos visible. Accès public selon la date d’ouverture au public.</w:t>
+              <w:t>Le responsable a sélectionné les photos retenues.</w:t>
             </w:r>
           </w:p>
         </w:tc>
       </w:tr>
     </w:tbl>
     <w:p/>
-    <w:tbl>
-      <w:tblPr>
-        <w:tblStyle w:val="TableGrid"/>
-        <w:tblW w:type="auto" w:w="0"/>
-        <w:tblLook w:firstColumn="1" w:firstRow="1" w:lastColumn="0" w:lastRow="0" w:noHBand="0" w:noVBand="1" w:val="04A0"/>
-      </w:tblPr>
-      <w:tblGrid>
-        <w:gridCol w:w="9406"/>
-      </w:tblGrid>
-      <w:tr>
-        <w:tc>
-          <w:tcPr>
-            <w:tcW w:type="dxa" w:w="9406"/>
-            <w:shd w:val="clear" w:color="auto" w:fill="FFFBEB"/>
-          </w:tcPr>
-          <w:p>
-            <w:r>
-              <w:rPr>
-                <w:rFonts w:ascii="Calibri" w:hAnsi="Calibri"/>
-                <w:color w:val="78350F"/>
-                <w:sz w:val="20"/>
-              </w:rPr>
-              <w:t>ℹ  Le titre, la description et les dates sont modifiables à tout moment via ✏ Modifier.</w:t>
-            </w:r>
-          </w:p>
-        </w:tc>
-      </w:tr>
-    </w:tbl>
-    <w:p/>
+    <w:p>
+      <w:pPr>
+        <w:pStyle w:val="Heading3"/>
+      </w:pPr>
+      <w:r>
+        <w:rPr>
+          <w:rFonts w:ascii="Calibri" w:hAnsi="Calibri"/>
+          <w:b/>
+          <w:color w:val="374151"/>
+          <w:sz w:val="24"/>
+        </w:rPr>
+        <w:t>4a — Le comité évalue</w:t>
+      </w:r>
+    </w:p>
+    <w:p>
+      <w:pPr/>
+      <w:r>
+        <w:rPr>
+          <w:rFonts w:ascii="Calibri" w:hAnsi="Calibri"/>
+          <w:sz w:val="22"/>
+        </w:rPr>
+        <w:t>Chaque membre du comité ouvre un dossier soumis et classe les photos du meilleur au moins bon. Il sauvegarde son classement quand c'est fait. Il peut évaluer les dossiers dans l'ordre qu'il veut, à son rythme.</w:t>
+      </w:r>
+    </w:p>
+    <w:p>
+      <w:pPr>
+        <w:pStyle w:val="ListBullet"/>
+        <w:ind w:left="283"/>
+      </w:pPr>
+      <w:r>
+        <w:rPr>
+          <w:rFonts w:ascii="Calibri" w:hAnsi="Calibri"/>
+          <w:sz w:val="22"/>
+        </w:rPr>
+        <w:t>Le compteur (ex : 2/5) indique combien de membres du comité ont déjà sauvegardé leur évaluation.</w:t>
+      </w:r>
+    </w:p>
+    <w:p>
+      <w:pPr>
+        <w:pStyle w:val="ListBullet"/>
+        <w:ind w:left="283"/>
+      </w:pPr>
+      <w:r>
+        <w:rPr>
+          <w:rFonts w:ascii="Calibri" w:hAnsi="Calibri"/>
+          <w:sz w:val="22"/>
+        </w:rPr>
+        <w:t>Filtre « À évaluer » : n'affiche que les dossiers que le membre connecté n'a pas encore évalués.</w:t>
+      </w:r>
+    </w:p>
+    <w:p>
+      <w:pPr>
+        <w:pStyle w:val="Heading3"/>
+      </w:pPr>
+      <w:r>
+        <w:rPr>
+          <w:rFonts w:ascii="Calibri" w:hAnsi="Calibri"/>
+          <w:b/>
+          <w:color w:val="374151"/>
+          <w:sz w:val="24"/>
+        </w:rPr>
+        <w:t>4b — Le responsable sélectionne et clôture</w:t>
+      </w:r>
+    </w:p>
+    <w:p>
+      <w:pPr/>
+      <w:r>
+        <w:rPr>
+          <w:rFonts w:ascii="Calibri" w:hAnsi="Calibri"/>
+          <w:sz w:val="22"/>
+        </w:rPr>
+        <w:t>Sans attendre que tout le monde ait fini, le responsable peut ouvrir un dossier, voir les scores agrégés du comité, cocher les photos retenues, et clôturer le dossier.</w:t>
+      </w:r>
+    </w:p>
+    <w:p>
+      <w:pPr>
+        <w:pStyle w:val="ListBullet"/>
+        <w:ind w:left="283"/>
+      </w:pPr>
+      <w:r>
+        <w:rPr>
+          <w:rFonts w:ascii="Calibri" w:hAnsi="Calibri"/>
+          <w:sz w:val="22"/>
+        </w:rPr>
+        <w:t>Sauvegarder : enregistre la sélection sans clôturer. Permet de mettre de côté un brouillon.</w:t>
+      </w:r>
+    </w:p>
+    <w:p>
+      <w:pPr>
+        <w:pStyle w:val="ListBullet"/>
+        <w:ind w:left="283"/>
+      </w:pPr>
+      <w:r>
+        <w:rPr>
+          <w:rFonts w:ascii="Calibri" w:hAnsi="Calibri"/>
+          <w:sz w:val="22"/>
+        </w:rPr>
+        <w:t>Clôturer le dossier : fige la sélection et passe le statut à Clôturé.</w:t>
+      </w:r>
+    </w:p>
+    <w:p>
+      <w:pPr>
+        <w:pStyle w:val="ListBullet"/>
+        <w:ind w:left="283"/>
+      </w:pPr>
+      <w:r>
+        <w:rPr>
+          <w:rFonts w:ascii="Calibri" w:hAnsi="Calibri"/>
+          <w:sz w:val="22"/>
+        </w:rPr>
+        <w:t>Filtre « Non clôturés » : n'affiche que les dossiers encore ouverts.</w:t>
+      </w:r>
+    </w:p>
+    <w:p>
+      <w:pPr>
+        <w:pStyle w:val="Heading3"/>
+      </w:pPr>
+      <w:r>
+        <w:rPr>
+          <w:rFonts w:ascii="Calibri" w:hAnsi="Calibri"/>
+          <w:b/>
+          <w:color w:val="374151"/>
+          <w:sz w:val="24"/>
+        </w:rPr>
+        <w:t>4c — Rouvrir un dossier</w:t>
+      </w:r>
+    </w:p>
+    <w:p>
+      <w:pPr/>
+      <w:r>
+        <w:rPr>
+          <w:rFonts w:ascii="Calibri" w:hAnsi="Calibri"/>
+          <w:sz w:val="22"/>
+        </w:rPr>
+        <w:t>Si nécessaire, le responsable peut rouvrir un dossier clôturé ou en cours d'évaluation :</w:t>
+      </w:r>
+    </w:p>
+    <w:p>
+      <w:pPr>
+        <w:pStyle w:val="ListBullet"/>
+        <w:ind w:left="283"/>
+      </w:pPr>
+      <w:r>
+        <w:rPr>
+          <w:rFonts w:ascii="Calibri" w:hAnsi="Calibri"/>
+          <w:sz w:val="22"/>
+        </w:rPr>
+        <w:t>Rouvrir en évaluation : le membre ne peut rien changer, mais le comité peut reclasser les photos.</w:t>
+      </w:r>
+    </w:p>
+    <w:p>
+      <w:pPr>
+        <w:pStyle w:val="ListBullet"/>
+        <w:ind w:left="283"/>
+      </w:pPr>
+      <w:r>
+        <w:rPr>
+          <w:rFonts w:ascii="Calibri" w:hAnsi="Calibri"/>
+          <w:sz w:val="22"/>
+        </w:rPr>
+        <w:t>Rouvrir en soumission : le membre peut à nouveau uploader ou supprimer des photos, puis re-soumettre. Les anciens classements du comité sont conservés comme point de départ.</w:t>
+      </w:r>
+    </w:p>
     <w:p>
       <w:r>
         <w:br w:type="page"/>

</xml_diff>

<commit_message>
updated expostion to separete role participent,comité,responsable un dedicated tab for role action clarity
</commit_message>
<xml_diff>
--- a/guide_du_site.docx
+++ b/guide_du_site.docx
@@ -4365,7 +4365,7 @@
           <w:color w:val="374151"/>
           <w:sz w:val="24"/>
         </w:rPr>
-        <w:t>Phase Soumission — tableau de bord</w:t>
+        <w:t>Phase Soumission — interface par onglets</w:t>
       </w:r>
     </w:p>
     <w:p>
@@ -4375,7 +4375,126 @@
           <w:rFonts w:ascii="Calibri" w:hAnsi="Calibri"/>
           <w:sz w:val="22"/>
         </w:rPr>
-        <w:t>Le tableau de bord liste tous les participants avec leur statut de dossier et le nombre de photos. Cliquez sur une ligne pour ouvrir le dossier du participant.</w:t>
+        <w:t>En phase Soumission, l'interface s'adapte automatiquement au rôle de la personne connectée. Trois onglets sont disponibles pour les membres du comité et le responsable :</w:t>
+      </w:r>
+    </w:p>
+    <w:tbl>
+      <w:tblPr>
+        <w:tblStyle w:val="TableGrid"/>
+        <w:tblW w:type="auto" w:w="0"/>
+        <w:jc w:val="left"/>
+        <w:tblLook w:firstColumn="1" w:firstRow="1" w:lastColumn="0" w:lastRow="0" w:noHBand="0" w:noVBand="1" w:val="04A0"/>
+      </w:tblPr>
+      <w:tblGrid>
+        <w:gridCol w:w="4703"/>
+        <w:gridCol w:w="4703"/>
+      </w:tblGrid>
+      <w:tr>
+        <w:tc>
+          <w:tcPr>
+            <w:tcW w:type="dxa" w:w="2835"/>
+          </w:tcPr>
+          <w:p>
+            <w:r>
+              <w:rPr>
+                <w:rFonts w:ascii="Calibri" w:hAnsi="Calibri"/>
+                <w:b/>
+                <w:color w:val="1A56DB"/>
+                <w:sz w:val="20"/>
+              </w:rPr>
+              <w:t>Participer</w:t>
+            </w:r>
+          </w:p>
+        </w:tc>
+        <w:tc>
+          <w:tcPr>
+            <w:tcW w:type="dxa" w:w="4703"/>
+          </w:tcPr>
+          <w:p>
+            <w:r>
+              <w:rPr>
+                <w:rFonts w:ascii="Calibri" w:hAnsi="Calibri"/>
+                <w:sz w:val="20"/>
+              </w:rPr>
+              <w:t>Visible pour tous les membres. Upload des photos, soumission au comité, consultation du statut de son dossier.</w:t>
+            </w:r>
+          </w:p>
+        </w:tc>
+      </w:tr>
+      <w:tr>
+        <w:tc>
+          <w:tcPr>
+            <w:tcW w:type="dxa" w:w="2835"/>
+          </w:tcPr>
+          <w:p>
+            <w:r>
+              <w:rPr>
+                <w:rFonts w:ascii="Calibri" w:hAnsi="Calibri"/>
+                <w:b/>
+                <w:color w:val="1A56DB"/>
+                <w:sz w:val="20"/>
+              </w:rPr>
+              <w:t>Évaluer</w:t>
+            </w:r>
+          </w:p>
+        </w:tc>
+        <w:tc>
+          <w:tcPr>
+            <w:tcW w:type="dxa" w:w="4703"/>
+          </w:tcPr>
+          <w:p>
+            <w:r>
+              <w:rPr>
+                <w:rFonts w:ascii="Calibri" w:hAnsi="Calibri"/>
+                <w:sz w:val="20"/>
+              </w:rPr>
+              <w:t>Visible pour les membres du comité uniquement. Classement des photos de chaque dossier soumis.</w:t>
+            </w:r>
+          </w:p>
+        </w:tc>
+      </w:tr>
+      <w:tr>
+        <w:tc>
+          <w:tcPr>
+            <w:tcW w:type="dxa" w:w="2835"/>
+          </w:tcPr>
+          <w:p>
+            <w:r>
+              <w:rPr>
+                <w:rFonts w:ascii="Calibri" w:hAnsi="Calibri"/>
+                <w:b/>
+                <w:color w:val="1A56DB"/>
+                <w:sz w:val="20"/>
+              </w:rPr>
+              <w:t>Sélectionner</w:t>
+            </w:r>
+          </w:p>
+        </w:tc>
+        <w:tc>
+          <w:tcPr>
+            <w:tcW w:type="dxa" w:w="4703"/>
+          </w:tcPr>
+          <w:p>
+            <w:r>
+              <w:rPr>
+                <w:rFonts w:ascii="Calibri" w:hAnsi="Calibri"/>
+                <w:sz w:val="20"/>
+              </w:rPr>
+              <w:t>Visible pour le responsable du comité uniquement. Sélection finale des photos, clôture des dossiers.</w:t>
+            </w:r>
+          </w:p>
+        </w:tc>
+      </w:tr>
+    </w:tbl>
+    <w:p/>
+    <w:p>
+      <w:pPr/>
+      <w:r>
+        <w:rPr>
+          <w:rFonts w:ascii="Calibri" w:hAnsi="Calibri"/>
+          <w:sz w:val="22"/>
+        </w:rPr>
+        <w:t>Le tableau de bord liste tous les participants avec leur statut de dossier et le nombre de photos. Cliquez sur une ligne pour ouvrir le dossier.</w:t>
       </w:r>
     </w:p>
     <w:tbl>
@@ -4455,7 +4574,7 @@
                 <w:rFonts w:ascii="Calibri" w:hAnsi="Calibri"/>
                 <w:sz w:val="20"/>
               </w:rPr>
-              <w:t>Le membre a soumis. Le comité peut évaluer.</w:t>
+              <w:t>Le membre a soumis. Le comité peut évaluer et le responsable peut sélectionner.</w:t>
             </w:r>
           </w:p>
         </w:tc>
@@ -4491,7 +4610,7 @@
                 <w:rFonts w:ascii="Calibri" w:hAnsi="Calibri"/>
                 <w:sz w:val="20"/>
               </w:rPr>
-              <w:t>Le responsable a sélectionné les photos retenues.</w:t>
+              <w:t>Le responsable a validé la sélection finale. Dossier figé.</w:t>
             </w:r>
           </w:p>
         </w:tc>
@@ -4509,7 +4628,7 @@
           <w:color w:val="374151"/>
           <w:sz w:val="24"/>
         </w:rPr>
-        <w:t>4a — Le comité évalue</w:t>
+        <w:t>4a — Le comité évalue (onglet Évaluer)</w:t>
       </w:r>
     </w:p>
     <w:p>
@@ -4545,7 +4664,7 @@
           <w:rFonts w:ascii="Calibri" w:hAnsi="Calibri"/>
           <w:sz w:val="22"/>
         </w:rPr>
-        <w:t>Filtre « À évaluer » : n'affiche que les dossiers que le membre connecté n'a pas encore évalués.</w:t>
+        <w:t>Filtre « Photos que je n'ai pas encore classées » : n'affiche que les dossiers que le membre connecté n'a pas encore évalués.</w:t>
       </w:r>
     </w:p>
     <w:p>
@@ -4559,7 +4678,7 @@
           <w:color w:val="374151"/>
           <w:sz w:val="24"/>
         </w:rPr>
-        <w:t>4b — Le responsable sélectionne et clôture</w:t>
+        <w:t>4b — Le responsable sélectionne et clôture (onglet Sélectionner)</w:t>
       </w:r>
     </w:p>
     <w:p>
@@ -4569,7 +4688,7 @@
           <w:rFonts w:ascii="Calibri" w:hAnsi="Calibri"/>
           <w:sz w:val="22"/>
         </w:rPr>
-        <w:t>Sans attendre que tout le monde ait fini, le responsable peut ouvrir un dossier, voir les scores agrégés du comité, cocher les photos retenues, et clôturer le dossier.</w:t>
+        <w:t>Sans attendre que tout le monde ait fini, le responsable peut ouvrir un dossier, consulter les scores agrégés du comité, cocher les photos à retenir, puis clôturer.</w:t>
       </w:r>
     </w:p>
     <w:p>
@@ -4582,7 +4701,7 @@
           <w:rFonts w:ascii="Calibri" w:hAnsi="Calibri"/>
           <w:sz w:val="22"/>
         </w:rPr>
-        <w:t>Sauvegarder : enregistre la sélection sans clôturer. Permet de mettre de côté un brouillon.</w:t>
+        <w:t>Sauvegarder : enregistre la sélection sans clôturer — permet de garder un brouillon.</w:t>
       </w:r>
     </w:p>
     <w:p>
@@ -4595,7 +4714,7 @@
           <w:rFonts w:ascii="Calibri" w:hAnsi="Calibri"/>
           <w:sz w:val="22"/>
         </w:rPr>
-        <w:t>Clôturer le dossier : fige la sélection et passe le statut à Clôturé.</w:t>
+        <w:t>Clôturer le dossier : fige définitivement la sélection. Une fois clôturé, les cases à cocher disparaissent et la sélection ne peut plus être modifiée sans ↩ Ré-ouvrir.</w:t>
       </w:r>
     </w:p>
     <w:p>
@@ -4608,7 +4727,60 @@
           <w:rFonts w:ascii="Calibri" w:hAnsi="Calibri"/>
           <w:sz w:val="22"/>
         </w:rPr>
-        <w:t>Filtre « Non clôturés » : n'affiche que les dossiers encore ouverts.</w:t>
+        <w:t>Filtre « Dossiers non encore clôturés par le responsable » : n'affiche que les dossiers encore ouverts.</w:t>
+      </w:r>
+    </w:p>
+    <w:tbl>
+      <w:tblPr>
+        <w:tblStyle w:val="TableGrid"/>
+        <w:tblW w:type="auto" w:w="0"/>
+        <w:tblLook w:firstColumn="1" w:firstRow="1" w:lastColumn="0" w:lastRow="0" w:noHBand="0" w:noVBand="1" w:val="04A0"/>
+      </w:tblPr>
+      <w:tblGrid>
+        <w:gridCol w:w="9406"/>
+      </w:tblGrid>
+      <w:tr>
+        <w:tc>
+          <w:tcPr>
+            <w:tcW w:type="dxa" w:w="9406"/>
+            <w:shd w:val="clear" w:color="auto" w:fill="FFFBEB"/>
+          </w:tcPr>
+          <w:p>
+            <w:r>
+              <w:rPr>
+                <w:rFonts w:ascii="Calibri" w:hAnsi="Calibri"/>
+                <w:color w:val="78350F"/>
+                <w:sz w:val="20"/>
+              </w:rPr>
+              <w:t>ℹ  Évaluation et sélection forment une seule étape. Clôturer signifie : évaluation terminée ET sélection validée. Plus aucune modification possible sans réouverture explicite.</w:t>
+            </w:r>
+          </w:p>
+        </w:tc>
+      </w:tr>
+    </w:tbl>
+    <w:p/>
+    <w:p>
+      <w:pPr>
+        <w:pStyle w:val="Heading3"/>
+      </w:pPr>
+      <w:r>
+        <w:rPr>
+          <w:rFonts w:ascii="Calibri" w:hAnsi="Calibri"/>
+          <w:b/>
+          <w:color w:val="374151"/>
+          <w:sz w:val="24"/>
+        </w:rPr>
+        <w:t>4c — Clôture globale</w:t>
+      </w:r>
+    </w:p>
+    <w:p>
+      <w:pPr/>
+      <w:r>
+        <w:rPr>
+          <w:rFonts w:ascii="Calibri" w:hAnsi="Calibri"/>
+          <w:sz w:val="22"/>
+        </w:rPr>
+        <w:t>Le bouton « Clôturer les sélections de photo — Ouvrir l'expo » en bas de page est l'action finale. Elle clôture définitivement tous les dossiers en cours et fait basculer l'exposition en mode final, sans retour en arrière possible. Cette action engage l'ensemble des participants.</w:t>
       </w:r>
     </w:p>
     <w:p>
@@ -4622,7 +4794,7 @@
           <w:color w:val="374151"/>
           <w:sz w:val="24"/>
         </w:rPr>
-        <w:t>4c — Rouvrir un dossier</w:t>
+        <w:t>4d — Rouvrir un dossier</w:t>
       </w:r>
     </w:p>
     <w:p>
@@ -4632,7 +4804,7 @@
           <w:rFonts w:ascii="Calibri" w:hAnsi="Calibri"/>
           <w:sz w:val="22"/>
         </w:rPr>
-        <w:t>Si nécessaire, le responsable peut rouvrir un dossier clôturé ou en cours d'évaluation :</w:t>
+        <w:t>Si nécessaire, le responsable peut rouvrir un dossier depuis l'onglet Sélectionner :</w:t>
       </w:r>
     </w:p>
     <w:p>
@@ -4645,7 +4817,7 @@
           <w:rFonts w:ascii="Calibri" w:hAnsi="Calibri"/>
           <w:sz w:val="22"/>
         </w:rPr>
-        <w:t>Rouvrir en évaluation : le membre ne peut rien changer, mais le comité peut reclasser les photos.</w:t>
+        <w:t>↩ Ré-ouvrir — Évaluation : le dossier repasse en phase évaluation/sélection. Le responsable peut ajuster sa sélection. Disponible depuis les statuts Évaluation et Clôturé.</w:t>
       </w:r>
     </w:p>
     <w:p>
@@ -4658,7 +4830,7 @@
           <w:rFonts w:ascii="Calibri" w:hAnsi="Calibri"/>
           <w:sz w:val="22"/>
         </w:rPr>
-        <w:t>Rouvrir en soumission : le membre peut à nouveau uploader ou supprimer des photos, puis re-soumettre. Les anciens classements du comité sont conservés comme point de départ.</w:t>
+        <w:t>↩ Ré-ouvrir — Soumission : le membre peut à nouveau uploader ou supprimer des photos, puis re-soumettre. Disponible depuis tous les statuts avancés.</w:t>
       </w:r>
     </w:p>
     <w:p>

</xml_diff>